<commit_message>
Clarify project navigation, verification scope and ranking comparator labels
</commit_message>
<xml_diff>
--- a/reports/ranking/within_grade_ranking_pilot.docx
+++ b/reports/ranking/within_grade_ranking_pilot.docx
@@ -2755,7 +2755,7 @@
         <w:keepNext/>
       </w:pPr>
       <w:r>
-        <w:t>Table 2. Global model ranking on each phase, pooled afterwards. This can change allocations between grades and does not isolate within-grade information.</w:t>
+        <w:t>Table 2. Global model ranking on each phase, pooled afterwards. Extra TP is measured against the grade-random expectation, not against Grade+ML. This can change allocations between grades and does not isolate within-grade information.</w:t>
       </w:r>
     </w:p>
     <w:tbl>
@@ -2879,7 +2879,7 @@
                 <w:b/>
                 <w:sz w:val="20"/>
               </w:rPr>
-              <w:t>Global extra TP [95%]</w:t>
+              <w:t>Global TP - grade-random E(TP) [95% CI]</w:t>
             </w:r>
           </w:p>
         </w:tc>

</xml_diff>

<commit_message>
Add computed allocation example and clickable report evidence sources
</commit_message>
<xml_diff>
--- a/reports/ranking/within_grade_ranking_pilot.docx
+++ b/reports/ranking/within_grade_ranking_pilot.docx
@@ -3316,6 +3316,19 @@
       </w:r>
     </w:p>
     <w:p>
+      <w:pPr>
+        <w:pStyle w:val="Heading1"/>
+      </w:pPr>
+      <w:r>
+        <w:t>Worked allocation example</w:t>
+      </w:r>
+    </w:p>
+    <w:p>
+      <w:r>
+        <w:t>Phase 1 has 516 records and 103 slots at the 20% budget. Both grade-priority methods include all 86 grade-b records, covering the same 15 hazardous records. The remaining 17 slots come from 430 grade-a records, including 21 hazardous records. ML detects 2 in that group; random selection expects 17*21/430 = 0.83. Total detections are 17 versus expected 15.83: an increment of 1.17 [-0.70, 5.68]. Only the partially selected grade-a group contributes to this within-grade increment. The interval includes zero; the example illustrates allocation rather than establishing a consistent ranking benefit.</w:t>
+      </w:r>
+    </w:p>
+    <w:p>
       <w:r>
         <w:t>These records are not verified simultaneously waiting inspection candidates. The pilot is retrospective batch ranking, not validation of real-time dispatch or accident prevention. Record order remains a temporal proxy. The present evidence does not establish a within-grade ranking increment or prove monitoring information useless. A source-attribution study would require matched grade-only and grade-plus-monitoring models, with shift type handled identically and equal fitting/tuning opportunities. That study has not been performed here.</w:t>
       </w:r>
@@ -3332,6 +3345,77 @@
       <w:r>
         <w:t>The protocol and execution code are in phase2/ranking/. Results under results/phase2/ranking/ retain row-level decisions and random inclusion probabilities, allocations, evaluations, analytic allocation distributions and every block draw and reranked contrast. The verifier uses independent sorting, weighted-prefix reranking and SciPy hypergeometric probabilities. Author review and AI assistance follow the repository CONTRIBUTIONS.md statement; computational evidence comes from saved data and actual execution.</w:t>
       </w:r>
+    </w:p>
+    <w:p>
+      <w:r>
+        <w:t>The links below preserve the source and evidence snapshot at commit e4c517b. The report presentation is generated by the current reporting code.</w:t>
+      </w:r>
+    </w:p>
+    <w:p>
+      <w:hyperlink r:id="rId1">
+        <w:r>
+          <w:rPr>
+            <w:color w:val="0563C1"/>
+            <w:u w:val="single"/>
+          </w:rPr>
+          <w:t>Repository source snapshot</w:t>
+        </w:r>
+      </w:hyperlink>
+    </w:p>
+    <w:p>
+      <w:hyperlink r:id="rId10">
+        <w:r>
+          <w:rPr>
+            <w:color w:val="0563C1"/>
+            <w:u w:val="single"/>
+          </w:rPr>
+          <w:t>Pilot protocol</w:t>
+        </w:r>
+      </w:hyperlink>
+    </w:p>
+    <w:p>
+      <w:hyperlink r:id="rId11">
+        <w:r>
+          <w:rPr>
+            <w:color w:val="0563C1"/>
+            <w:u w:val="single"/>
+          </w:rPr>
+          <w:t>Ranking code</w:t>
+        </w:r>
+      </w:hyperlink>
+    </w:p>
+    <w:p>
+      <w:hyperlink r:id="rId12">
+        <w:r>
+          <w:rPr>
+            <w:color w:val="0563C1"/>
+            <w:u w:val="single"/>
+          </w:rPr>
+          <w:t>Saved evidence and verification guide</w:t>
+        </w:r>
+      </w:hyperlink>
+    </w:p>
+    <w:p>
+      <w:hyperlink r:id="rId13">
+        <w:r>
+          <w:rPr>
+            <w:color w:val="0563C1"/>
+            <w:u w:val="single"/>
+          </w:rPr>
+          <w:t>Numerical verifier</w:t>
+        </w:r>
+      </w:hyperlink>
+    </w:p>
+    <w:p>
+      <w:hyperlink r:id="rId14">
+        <w:r>
+          <w:rPr>
+            <w:color w:val="0563C1"/>
+            <w:u w:val="single"/>
+          </w:rPr>
+          <w:t>Integrated report</w:t>
+        </w:r>
+      </w:hyperlink>
     </w:p>
     <w:sectPr>
       <w:footerReference w:type="default" r:id="rId9"/>

</xml_diff>